<commit_message>
feat: add new daily inspection document template for dumper vehicles
</commit_message>
<xml_diff>
--- a/storage/app/templates/Loader-daily-inspection.docx
+++ b/storage/app/templates/Loader-daily-inspection.docx
@@ -14,21 +14,22 @@
           <w:insideH w:val="single" w:sz="8" w:space="0" w:color="auto"/>
           <w:insideV w:val="single" w:sz="8" w:space="0" w:color="auto"/>
         </w:tblBorders>
+        <w:tblLayout w:type="fixed"/>
         <w:tblLook w:val="0000" w:firstRow="0" w:lastRow="0" w:firstColumn="0" w:lastColumn="0" w:noHBand="0" w:noVBand="0"/>
       </w:tblPr>
       <w:tblGrid>
-        <w:gridCol w:w="878"/>
-        <w:gridCol w:w="862"/>
-        <w:gridCol w:w="904"/>
-        <w:gridCol w:w="955"/>
-        <w:gridCol w:w="785"/>
-        <w:gridCol w:w="920"/>
-        <w:gridCol w:w="1082"/>
-        <w:gridCol w:w="151"/>
-        <w:gridCol w:w="1108"/>
-        <w:gridCol w:w="231"/>
-        <w:gridCol w:w="803"/>
-        <w:gridCol w:w="2357"/>
+        <w:gridCol w:w="1080"/>
+        <w:gridCol w:w="1002"/>
+        <w:gridCol w:w="1096"/>
+        <w:gridCol w:w="1067"/>
+        <w:gridCol w:w="880"/>
+        <w:gridCol w:w="1007"/>
+        <w:gridCol w:w="1164"/>
+        <w:gridCol w:w="177"/>
+        <w:gridCol w:w="1220"/>
+        <w:gridCol w:w="265"/>
+        <w:gridCol w:w="1080"/>
+        <w:gridCol w:w="998"/>
       </w:tblGrid>
       <w:tr>
         <w:trPr>
@@ -1433,21 +1434,18 @@
                 <w:szCs w:val="16"/>
                 <w:rtl/>
               </w:rPr>
-              <w:t xml:space="preserve">) </w:t>
-            </w:r>
-            <w:proofErr w:type="gramStart"/>
-            <w:r>
-              <w:rPr>
-                <w:rFonts w:hint="cs"/>
+              <w:t>) اذا كانت نتيجة الفحص (نعم)، أو علامة (</w:t>
+            </w:r>
+            <w:r>
+              <w:rPr>
                 <w:b/>
                 <w:bCs/>
                 <w:sz w:val="16"/>
                 <w:szCs w:val="16"/>
                 <w:rtl/>
               </w:rPr>
-              <w:t>اذا</w:t>
-            </w:r>
-            <w:proofErr w:type="gramEnd"/>
+              <w:t>×</w:t>
+            </w:r>
             <w:r>
               <w:rPr>
                 <w:rFonts w:hint="cs"/>
@@ -1457,30 +1455,29 @@
                 <w:szCs w:val="16"/>
                 <w:rtl/>
               </w:rPr>
-              <w:t xml:space="preserve"> كانت نتيجة الفحص (نعم)، أو علامة (</w:t>
-            </w:r>
-            <w:r>
+              <w:t>) اذا كانت نتيجة الفحص (لا)</w:t>
+            </w:r>
+          </w:p>
+          <w:p>
+            <w:pPr>
+              <w:spacing w:after="0" w:line="240" w:lineRule="auto"/>
+              <w:jc w:val="center"/>
               <w:rPr>
                 <w:b/>
                 <w:bCs/>
                 <w:sz w:val="16"/>
                 <w:szCs w:val="16"/>
-                <w:rtl/>
-              </w:rPr>
-              <w:t>×</w:t>
-            </w:r>
-            <w:r>
-              <w:rPr>
-                <w:rFonts w:hint="cs"/>
+              </w:rPr>
+            </w:pPr>
+            <w:r>
+              <w:rPr>
                 <w:b/>
                 <w:bCs/>
                 <w:sz w:val="16"/>
                 <w:szCs w:val="16"/>
-                <w:rtl/>
-              </w:rPr>
-              <w:t xml:space="preserve">) </w:t>
-            </w:r>
-            <w:proofErr w:type="gramStart"/>
+              </w:rPr>
+              <w:t>mark (√) if Check is positive and (×)</w:t>
+            </w:r>
             <w:r>
               <w:rPr>
                 <w:rFonts w:hint="cs"/>
@@ -1490,80 +1487,16 @@
                 <w:szCs w:val="16"/>
                 <w:rtl/>
               </w:rPr>
-              <w:t>اذا</w:t>
-            </w:r>
-            <w:proofErr w:type="gramEnd"/>
-            <w:r>
-              <w:rPr>
-                <w:rFonts w:hint="cs"/>
+              <w:t xml:space="preserve"> </w:t>
+            </w:r>
+            <w:r>
+              <w:rPr>
                 <w:b/>
                 <w:bCs/>
                 <w:sz w:val="16"/>
                 <w:szCs w:val="16"/>
-                <w:rtl/>
-              </w:rPr>
-              <w:t xml:space="preserve"> كانت نتيجة الفحص (لا)</w:t>
-            </w:r>
-          </w:p>
-          <w:p>
-            <w:pPr>
-              <w:spacing w:after="0" w:line="240" w:lineRule="auto"/>
-              <w:jc w:val="center"/>
-              <w:rPr>
-                <w:b/>
-                <w:bCs/>
-                <w:sz w:val="16"/>
-                <w:szCs w:val="16"/>
-              </w:rPr>
-            </w:pPr>
-            <w:r>
-              <w:rPr>
-                <w:b/>
-                <w:bCs/>
-                <w:sz w:val="16"/>
-                <w:szCs w:val="16"/>
-              </w:rPr>
-              <w:t>mark (√) if Check is positive and (</w:t>
-            </w:r>
-            <w:proofErr w:type="gramStart"/>
-            <w:r>
-              <w:rPr>
-                <w:b/>
-                <w:bCs/>
-                <w:sz w:val="16"/>
-                <w:szCs w:val="16"/>
-              </w:rPr>
-              <w:t>×)</w:t>
-            </w:r>
-            <w:r>
-              <w:rPr>
-                <w:rFonts w:hint="cs"/>
-                <w:b/>
-                <w:bCs/>
-                <w:sz w:val="16"/>
-                <w:szCs w:val="16"/>
-                <w:rtl/>
-              </w:rPr>
-              <w:t xml:space="preserve"> </w:t>
-            </w:r>
-            <w:r>
-              <w:rPr>
-                <w:b/>
-                <w:bCs/>
-                <w:sz w:val="16"/>
-                <w:szCs w:val="16"/>
-              </w:rPr>
-              <w:t xml:space="preserve"> if</w:t>
-            </w:r>
-            <w:proofErr w:type="gramEnd"/>
-            <w:r>
-              <w:rPr>
-                <w:b/>
-                <w:bCs/>
-                <w:sz w:val="16"/>
-                <w:szCs w:val="16"/>
-              </w:rPr>
-              <w:t xml:space="preserve"> Check is negative</w:t>
+              </w:rPr>
+              <w:t xml:space="preserve"> if Check is negative</w:t>
             </w:r>
           </w:p>
         </w:tc>
@@ -3004,51 +2937,7 @@
                 <w:szCs w:val="18"/>
                 <w:rtl/>
               </w:rPr>
-              <w:t xml:space="preserve">فحص الزيوت </w:t>
-            </w:r>
-            <w:proofErr w:type="gramStart"/>
-            <w:r>
-              <w:rPr>
-                <w:b/>
-                <w:bCs/>
-                <w:sz w:val="18"/>
-                <w:szCs w:val="18"/>
-                <w:rtl/>
-              </w:rPr>
-              <w:t>( موتور</w:t>
-            </w:r>
-            <w:proofErr w:type="gramEnd"/>
-            <w:r>
-              <w:rPr>
-                <w:b/>
-                <w:bCs/>
-                <w:sz w:val="18"/>
-                <w:szCs w:val="18"/>
-                <w:rtl/>
-              </w:rPr>
-              <w:t xml:space="preserve"> &amp; </w:t>
-            </w:r>
-            <w:proofErr w:type="gramStart"/>
-            <w:r>
-              <w:rPr>
-                <w:b/>
-                <w:bCs/>
-                <w:sz w:val="18"/>
-                <w:szCs w:val="18"/>
-                <w:rtl/>
-              </w:rPr>
-              <w:t>هيدروليك )</w:t>
-            </w:r>
-            <w:proofErr w:type="gramEnd"/>
-            <w:r>
-              <w:rPr>
-                <w:b/>
-                <w:bCs/>
-                <w:sz w:val="18"/>
-                <w:szCs w:val="18"/>
-                <w:rtl/>
-              </w:rPr>
-              <w:t xml:space="preserve"> </w:t>
+              <w:t xml:space="preserve">فحص الزيوت ( موتور &amp; هيدروليك ) </w:t>
             </w:r>
           </w:p>
           <w:p>
@@ -5999,29 +5888,7 @@
                 <w:szCs w:val="18"/>
                 <w:rtl/>
               </w:rPr>
-              <w:t xml:space="preserve">حزام الأمان </w:t>
-            </w:r>
-            <w:proofErr w:type="gramStart"/>
-            <w:r>
-              <w:rPr>
-                <w:b/>
-                <w:bCs/>
-                <w:sz w:val="18"/>
-                <w:szCs w:val="18"/>
-                <w:rtl/>
-              </w:rPr>
-              <w:t>موجوده</w:t>
-            </w:r>
-            <w:proofErr w:type="gramEnd"/>
-            <w:r>
-              <w:rPr>
-                <w:b/>
-                <w:bCs/>
-                <w:sz w:val="18"/>
-                <w:szCs w:val="18"/>
-                <w:rtl/>
-              </w:rPr>
-              <w:t xml:space="preserve"> وبحاله جيده </w:t>
+              <w:t xml:space="preserve">حزام الأمان موجوده وبحاله جيده </w:t>
             </w:r>
           </w:p>
           <w:p>
@@ -7700,6 +7567,7 @@
                 <w:sz w:val="6"/>
                 <w:szCs w:val="8"/>
               </w:rPr>
+              <w:lastRenderedPageBreak/>
               <w:t>${</w:t>
             </w:r>
             <w:proofErr w:type="spellStart"/>
@@ -8017,7 +7885,6 @@
                 <w:sz w:val="6"/>
                 <w:szCs w:val="8"/>
               </w:rPr>
-              <w:lastRenderedPageBreak/>
               <w:t>${</w:t>
             </w:r>
             <w:proofErr w:type="spellStart"/>

</xml_diff>